<commit_message>
change: Nemotron 3.5 스트리밍을 320 / 560 ms 2종으로 축소 — 80 / 160 / 1120 ms 삭제 (v2.2.0 유지)
- 사용자 결정 Q28: 320 / 560 ms 만 필요
- SherpaCatalog / SttCatalog / download_stt_models.sh(all = 9종) / README / CSV 설명서 / 릴리스 노트 v2.2.0(MD·docx) / HANDOFF v2.2.0
- v2.2.0 은 아직 원격에 올라가지 않아 판 번호를 유지한다(v2.1.0 fix 와 같은 처리)

Co-Authored-By: Claude Opus 5.5 <noreply@anthropic.com>
Claude-Session: https://claude.ai/code/session_01Tx1hB5ciP2kUveuy9cJMpc
</commit_message>
<xml_diff>
--- a/docs/RELEASE_NOTES_v2.2.0.docx
+++ b/docs/RELEASE_NOTES_v2.2.0.docx
@@ -119,7 +119,7 @@
         <w:t xml:space="preserve">Nemotron 3.5 ASR 스트리밍 0.6B (int8)</w:t>
       </w:r>
       <w:r>
-        <w:t xml:space="preserve"> — 2단계 2-2(사용자 결정 Q25~Q27)</w:t>
+        <w:t xml:space="preserve"> — 2단계 2-2(사용자 결정 Q25~Q28)</w:t>
       </w:r>
     </w:p>
     <w:tbl>
@@ -272,7 +272,7 @@
           </w:tcPr>
           <w:p>
             <w:r>
-              <w:t xml:space="preserve">Nemotron 3.5 streaming 80 / 160 / 320 / 560 / 1120 ms</w:t>
+              <w:t xml:space="preserve">Nemotron 3.5 streaming 320 / 560 ms</w:t>
             </w:r>
           </w:p>
         </w:tc>
@@ -297,16 +297,16 @@
               <w:rPr>
                 <w:rFonts w:ascii="Consolas" w:cs="Consolas" w:eastAsia="Consolas" w:hAnsi="Consolas"/>
               </w:rPr>
-              <w:t xml:space="preserve">nemotron3.5-80ms</w:t>
-            </w:r>
-            <w:r>
-              <w:t xml:space="preserve"> … </w:t>
+              <w:t xml:space="preserve">nemotron3.5-320ms</w:t>
+            </w:r>
+            <w:r>
+              <w:t xml:space="preserve"> / </w:t>
             </w:r>
             <w:r>
               <w:rPr>
                 <w:rFonts w:ascii="Consolas" w:cs="Consolas" w:eastAsia="Consolas" w:hAnsi="Consolas"/>
               </w:rPr>
-              <w:t xml:space="preserve">nemotron3.5-1120ms</w:t>
+              <w:t xml:space="preserve">nemotron3.5-560ms</w:t>
             </w:r>
           </w:p>
         </w:tc>
@@ -569,16 +569,16 @@
         <w:rPr>
           <w:rFonts w:ascii="Consolas" w:cs="Consolas" w:eastAsia="Consolas" w:hAnsi="Consolas"/>
         </w:rPr>
-        <w:t xml:space="preserve">nemotron3.5-80ms</w:t>
-      </w:r>
-      <w:r>
-        <w:t xml:space="preserve"> … </w:t>
-      </w:r>
-      <w:r>
-        <w:rPr>
-          <w:rFonts w:ascii="Consolas" w:cs="Consolas" w:eastAsia="Consolas" w:hAnsi="Consolas"/>
-        </w:rPr>
-        <w:t xml:space="preserve">nemotron3.5-1120ms</w:t>
+        <w:t xml:space="preserve">nemotron3.5-320ms</w:t>
+      </w:r>
+      <w:r>
+        <w:t xml:space="preserve"> / </w:t>
+      </w:r>
+      <w:r>
+        <w:rPr>
+          <w:rFonts w:ascii="Consolas" w:cs="Consolas" w:eastAsia="Consolas" w:hAnsi="Consolas"/>
+        </w:rPr>
+        <w:t xml:space="preserve">nemotron3.5-560ms</w:t>
       </w:r>
       <w:r>
         <w:t xml:space="preserve"> 추가, 기본 받기에 </w:t>
@@ -591,6 +591,29 @@
       </w:r>
       <w:r>
         <w:t xml:space="preserve"> 추가.</w:t>
+      </w:r>
+    </w:p>
+    <w:p>
+      <w:pPr>
+        <w:pStyle w:val="ListParagraph"/>
+        <w:numPr>
+          <w:ilvl w:val="0"/>
+          <w:numId w:val="3"/>
+        </w:numPr>
+        <w:spacing w:after="60"/>
+      </w:pPr>
+      <w:r>
+        <w:t xml:space="preserve">(2026-10-11, 배포 전 조정 — 사용자 결정 Q28) 처음에는 지연 5종(80 / 160 / 320 / 560 / 1120 ms)을 등록했으나 </w:t>
+      </w:r>
+      <w:r>
+        <w:rPr>
+          <w:b/>
+          <w:bCs/>
+        </w:rPr>
+        <w:t xml:space="preserve">320 / 560 ms 2종만</w:t>
+      </w:r>
+      <w:r>
+        <w:t xml:space="preserve"> 남겼다. 공식 패키지는 5종이 그대로 있다.</w:t>
       </w:r>
     </w:p>
     <w:p>

</xml_diff>